<commit_message>
Move the workflow scripts into scripts/
The repository root now holds project metadata only; the six runnable
scripts live in scripts/ (library code stays in src/wine_quality/).
Each script resolves the project root as parents[1]; every reference
in the Dockerfile, compose.yaml, the CI workflow, README, CLAUDE.md,
the guides, the archive builder and the app's error text is updated.

package_download.py archives the scripts/ folder, and the zip it builds
(app/wine-quality-python.zip, produced at deploy time) is now ignored.

The experiment service disables bytecode recompilation at run time; with
the bind mount, uv reinstalls the project on each run and the compile
step stalled under Docker Desktop's amd64 emulation.

Verified: tests, the guide rebuild, the archive contents, the local and
containerised dashboard, and `docker compose run --rm experiment`
reproducing the committed results.json.

Co-Authored-By: Claude Opus 5 <noreply@anthropic.com>
</commit_message>
<xml_diff>
--- a/app/wine-quality-learning-guide.docx
+++ b/app/wine-quality-learning-guide.docx
@@ -5930,7 +5930,7 @@
                 <w:rFonts w:ascii="Consolas" w:hAnsi="Consolas"/>
                 <w:sz w:val="21"/>
               </w:rPr>
-              <w:t>train.py</w:t>
+              <w:t>scripts/train.py</w:t>
             </w:r>
           </w:p>
         </w:tc>
@@ -5986,7 +5986,7 @@
                 <w:rFonts w:ascii="Consolas" w:hAnsi="Consolas"/>
                 <w:sz w:val="21"/>
               </w:rPr>
-              <w:t>bootstrap_structure.py</w:t>
+              <w:t>scripts/bootstrap_structure.py</w:t>
             </w:r>
           </w:p>
         </w:tc>
@@ -6042,7 +6042,7 @@
                 <w:rFonts w:ascii="Consolas" w:hAnsi="Consolas"/>
                 <w:sz w:val="21"/>
               </w:rPr>
-              <w:t>export_reference.py</w:t>
+              <w:t>scripts/export_reference.py</w:t>
             </w:r>
           </w:p>
         </w:tc>
@@ -6329,7 +6329,7 @@
           <w:rFonts w:ascii="Consolas" w:hAnsi="Consolas"/>
           <w:sz w:val="19"/>
         </w:rPr>
-        <w:t>python serve.py</w:t>
+        <w:t>python scripts/serve.py</w:t>
       </w:r>
       <w:r>
         <w:t xml:space="preserve">, then open </w:t>
@@ -6374,7 +6374,7 @@
           <w:rFonts w:ascii="Consolas" w:hAnsi="Consolas"/>
           <w:sz w:val="19"/>
         </w:rPr>
-        <w:t>python train.py</w:t>
+        <w:t>python scripts/train.py</w:t>
       </w:r>
       <w:r>
         <w:t xml:space="preserve"> followed by </w:t>
@@ -6384,7 +6384,7 @@
           <w:rFonts w:ascii="Consolas" w:hAnsi="Consolas"/>
           <w:sz w:val="19"/>
         </w:rPr>
-        <w:t>python bootstrap_structure.py</w:t>
+        <w:t>python scripts/bootstrap_structure.py</w:t>
       </w:r>
       <w:r>
         <w:t xml:space="preserve"> for the arrow stability shown in the network view and </w:t>
@@ -6394,7 +6394,7 @@
           <w:rFonts w:ascii="Consolas" w:hAnsi="Consolas"/>
           <w:sz w:val="19"/>
         </w:rPr>
-        <w:t>python export_reference.py</w:t>
+        <w:t>python scripts/export_reference.py</w:t>
       </w:r>
       <w:r>
         <w:t xml:space="preserve"> for the prediction reference. A virtual environment is a separate set of Python packages for this project. </w:t>
@@ -7983,7 +7983,7 @@
           <w:rFonts w:ascii="Consolas" w:hAnsi="Consolas"/>
           <w:sz w:val="19"/>
         </w:rPr>
-        <w:t>build_guide.py</w:t>
+        <w:t>scripts/build_guide.py</w:t>
       </w:r>
       <w:r>
         <w:t xml:space="preserve">. You can inspect row-level outputs in </w:t>

</xml_diff>